<commit_message>
new check in 'check_network_correctness'
</commit_message>
<xml_diff>
--- a/src/tests_for_10_12/test_description.docx
+++ b/src/tests_for_10_12/test_description.docx
@@ -3,16 +3,22 @@
 <w:document xmlns:wpc="http://schemas.microsoft.com/office/word/2010/wordprocessingCanvas" xmlns:cx="http://schemas.microsoft.com/office/drawing/2014/chartex" xmlns:cx1="http://schemas.microsoft.com/office/drawing/2015/9/8/chartex" xmlns:mc="http://schemas.openxmlformats.org/markup-compatibility/2006" xmlns:o="urn:schemas-microsoft-com:office:office" xmlns:r="http://schemas.openxmlformats.org/officeDocument/2006/relationships" xmlns:m="http://schemas.openxmlformats.org/officeDocument/2006/math" xmlns:v="urn:schemas-microsoft-com:vml" xmlns:wp14="http://schemas.microsoft.com/office/word/2010/wordprocessingDrawing" xmlns:wp="http://schemas.openxmlformats.org/drawingml/2006/wordprocessingDrawing" xmlns:w10="urn:schemas-microsoft-com:office:word" xmlns:w="http://schemas.openxmlformats.org/wordprocessingml/2006/main" xmlns:w14="http://schemas.microsoft.com/office/word/2010/wordml" xmlns:w15="http://schemas.microsoft.com/office/word/2012/wordml" xmlns:w16se="http://schemas.microsoft.com/office/word/2015/wordml/symex" xmlns:wpg="http://schemas.microsoft.com/office/word/2010/wordprocessingGroup" xmlns:wpi="http://schemas.microsoft.com/office/word/2010/wordprocessingInk" xmlns:wne="http://schemas.microsoft.com/office/word/2006/wordml" xmlns:wps="http://schemas.microsoft.com/office/word/2010/wordprocessingShape" mc:Ignorable="w14 w15 w16se wp14">
   <w:body>
     <w:p>
-      <w:pPr>
+      <w:bookmarkStart w:id="0" w:name="_GoBack"/>
+      <w:bookmarkEnd w:id="0"/>
+      <w:r>
         <w:rPr>
           <w:lang w:val="en-US"/>
         </w:rPr>
-      </w:pPr>
+        <w:t>test</w:t>
+      </w:r>
+      <w:r>
+        <w:t>2.</w:t>
+      </w:r>
       <w:r>
         <w:rPr>
           <w:lang w:val="en-US"/>
         </w:rPr>
-        <w:t>test1.txt</w:t>
+        <w:t>txt</w:t>
       </w:r>
     </w:p>
     <w:p>
@@ -40,32 +46,23 @@
         <w:t>n</w:t>
       </w:r>
       <w:r>
-        <w:t>1</w:t>
-      </w:r>
-      <w:r>
-        <w:t xml:space="preserve"> </w:t>
-      </w:r>
-      <w:r>
-        <w:t>превращается в крюк)</w:t>
+        <w:t xml:space="preserve">3 </w:t>
+      </w:r>
+      <w:r>
+        <w:t>превратится в никуда не подключенную петлю)</w:t>
       </w:r>
     </w:p>
-    <w:p/>
     <w:p>
-      <w:pPr>
-        <w:rPr>
-          <w:lang w:val="en-US"/>
-        </w:rPr>
-      </w:pPr>
       <w:r>
         <w:rPr>
           <w:noProof/>
           <w:lang w:eastAsia="ru-RU"/>
         </w:rPr>
         <w:drawing>
-          <wp:inline distT="0" distB="0" distL="0" distR="0" wp14:anchorId="4644290C" wp14:editId="2A6E5BDB">
-            <wp:extent cx="5940425" cy="2505710"/>
-            <wp:effectExtent l="0" t="0" r="3175" b="8890"/>
-            <wp:docPr id="2" name="Рисунок 2"/>
+          <wp:inline distT="0" distB="0" distL="0" distR="0" wp14:anchorId="61E9B402" wp14:editId="7D3BA43F">
+            <wp:extent cx="5940425" cy="3154045"/>
+            <wp:effectExtent l="0" t="0" r="3175" b="8255"/>
+            <wp:docPr id="3" name="Рисунок 3"/>
             <wp:cNvGraphicFramePr>
               <a:graphicFrameLocks xmlns:a="http://schemas.openxmlformats.org/drawingml/2006/main" noChangeAspect="1"/>
             </wp:cNvGraphicFramePr>
@@ -85,7 +82,7 @@
                   <pic:spPr>
                     <a:xfrm>
                       <a:off x="0" y="0"/>
-                      <a:ext cx="5940425" cy="2505710"/>
+                      <a:ext cx="5940425" cy="3154045"/>
                     </a:xfrm>
                     <a:prstGeom prst="rect">
                       <a:avLst/>
@@ -105,88 +102,6 @@
           <w:lang w:val="en-US"/>
         </w:rPr>
       </w:pPr>
-      <w:r>
-        <w:rPr>
-          <w:lang w:val="en-US"/>
-        </w:rPr>
-        <w:t>test2.txt</w:t>
-      </w:r>
-      <w:bookmarkStart w:id="0" w:name="_GoBack"/>
-      <w:bookmarkEnd w:id="0"/>
-    </w:p>
-    <w:p>
-      <w:r>
-        <w:t xml:space="preserve">Схема </w:t>
-      </w:r>
-      <w:proofErr w:type="spellStart"/>
-      <w:r>
-        <w:t>нетлиста</w:t>
-      </w:r>
-      <w:proofErr w:type="spellEnd"/>
-      <w:r>
-        <w:t>:</w:t>
-      </w:r>
-      <w:r>
-        <w:t xml:space="preserve"> (</w:t>
-      </w:r>
-      <w:r>
-        <w:t xml:space="preserve">при подстановке цепь </w:t>
-      </w:r>
-      <w:r>
-        <w:rPr>
-          <w:lang w:val="en-US"/>
-        </w:rPr>
-        <w:t>n</w:t>
-      </w:r>
-      <w:r>
-        <w:t xml:space="preserve">3 </w:t>
-      </w:r>
-      <w:r>
-        <w:t>превратится в никуда не подключенную петлю)</w:t>
-      </w:r>
-    </w:p>
-    <w:p>
-      <w:r>
-        <w:rPr>
-          <w:noProof/>
-          <w:lang w:eastAsia="ru-RU"/>
-        </w:rPr>
-        <w:drawing>
-          <wp:inline distT="0" distB="0" distL="0" distR="0" wp14:anchorId="4A9E5769" wp14:editId="350CB9D5">
-            <wp:extent cx="5940425" cy="2964180"/>
-            <wp:effectExtent l="0" t="0" r="3175" b="7620"/>
-            <wp:docPr id="3" name="Рисунок 3"/>
-            <wp:cNvGraphicFramePr>
-              <a:graphicFrameLocks xmlns:a="http://schemas.openxmlformats.org/drawingml/2006/main" noChangeAspect="1"/>
-            </wp:cNvGraphicFramePr>
-            <a:graphic xmlns:a="http://schemas.openxmlformats.org/drawingml/2006/main">
-              <a:graphicData uri="http://schemas.openxmlformats.org/drawingml/2006/picture">
-                <pic:pic xmlns:pic="http://schemas.openxmlformats.org/drawingml/2006/picture">
-                  <pic:nvPicPr>
-                    <pic:cNvPr id="1" name=""/>
-                    <pic:cNvPicPr/>
-                  </pic:nvPicPr>
-                  <pic:blipFill>
-                    <a:blip r:embed="rId5"/>
-                    <a:stretch>
-                      <a:fillRect/>
-                    </a:stretch>
-                  </pic:blipFill>
-                  <pic:spPr>
-                    <a:xfrm>
-                      <a:off x="0" y="0"/>
-                      <a:ext cx="5940425" cy="2964180"/>
-                    </a:xfrm>
-                    <a:prstGeom prst="rect">
-                      <a:avLst/>
-                    </a:prstGeom>
-                  </pic:spPr>
-                </pic:pic>
-              </a:graphicData>
-            </a:graphic>
-          </wp:inline>
-        </w:drawing>
-      </w:r>
     </w:p>
     <w:sectPr>
       <w:pgSz w:w="11906" w:h="16838"/>

</xml_diff>